<commit_message>
Crossed out cookie plan
It will be replaced by accounts.
</commit_message>
<xml_diff>
--- a/Food My Thought.docx
+++ b/Food My Thought.docx
@@ -3155,73 +3155,147 @@
       </w:r>
     </w:p>
     <w:p>
-      <w:r>
+      <w:pPr>
+        <w:rPr>
+          <w:strike/>
+        </w:rPr>
+      </w:pPr>
+      <w:r>
+        <w:rPr>
+          <w:strike/>
+        </w:rPr>
         <w:t>That is, I would be hesitant to use this app if it required me to send my e-mail</w:t>
       </w:r>
       <w:r>
+        <w:rPr>
+          <w:strike/>
+        </w:rPr>
         <w:t xml:space="preserve"> and type in a password every time I called on nameless </w:t>
       </w:r>
       <w:proofErr w:type="spellStart"/>
       <w:r>
+        <w:rPr>
+          <w:strike/>
+        </w:rPr>
         <w:t>trash</w:t>
       </w:r>
       <w:r>
+        <w:rPr>
+          <w:strike/>
+        </w:rPr>
         <w:t>posters</w:t>
       </w:r>
       <w:proofErr w:type="spellEnd"/>
       <w:r>
+        <w:rPr>
+          <w:strike/>
+        </w:rPr>
         <w:t xml:space="preserve"> and internet trolls to tell me what exactly to do with my Quinoa.</w:t>
       </w:r>
     </w:p>
     <w:p>
-      <w:r>
+      <w:pPr>
+        <w:rPr>
+          <w:strike/>
+        </w:rPr>
+      </w:pPr>
+      <w:r>
+        <w:rPr>
+          <w:strike/>
+        </w:rPr>
         <w:t>As such, this app would rely on cookies.</w:t>
       </w:r>
     </w:p>
     <w:p>
-      <w:r>
+      <w:pPr>
+        <w:rPr>
+          <w:strike/>
+        </w:rPr>
+      </w:pPr>
+      <w:r>
+        <w:rPr>
+          <w:strike/>
+        </w:rPr>
         <w:t xml:space="preserve">The </w:t>
       </w:r>
       <w:proofErr w:type="spellStart"/>
       <w:proofErr w:type="gramStart"/>
       <w:r>
+        <w:rPr>
+          <w:strike/>
+        </w:rPr>
         <w:t>url</w:t>
       </w:r>
       <w:proofErr w:type="spellEnd"/>
       <w:proofErr w:type="gramEnd"/>
       <w:r>
-        <w:t xml:space="preserve"> for the </w:t>
-      </w:r>
-      <w:proofErr w:type="spellStart"/>
-      <w:r>
+        <w:rPr>
+          <w:strike/>
+        </w:rPr>
+        <w:t xml:space="preserve"> for </w:t>
+      </w:r>
+      <w:bookmarkStart w:id="10" w:name="_GoBack"/>
+      <w:bookmarkEnd w:id="10"/>
+      <w:r>
+        <w:rPr>
+          <w:strike/>
+        </w:rPr>
+        <w:t xml:space="preserve">the </w:t>
+      </w:r>
+      <w:proofErr w:type="spellStart"/>
+      <w:r>
+        <w:rPr>
+          <w:strike/>
+        </w:rPr>
         <w:t>lister</w:t>
       </w:r>
       <w:proofErr w:type="spellEnd"/>
       <w:r>
+        <w:rPr>
+          <w:strike/>
+        </w:rPr>
         <w:t xml:space="preserve"> page would be the same, </w:t>
       </w:r>
       <w:proofErr w:type="spellStart"/>
       <w:r>
+        <w:rPr>
+          <w:strike/>
+        </w:rPr>
         <w:t>irreguardless</w:t>
       </w:r>
       <w:proofErr w:type="spellEnd"/>
       <w:r>
+        <w:rPr>
+          <w:strike/>
+        </w:rPr>
         <w:t xml:space="preserve"> of who is the one posting. Each </w:t>
       </w:r>
       <w:proofErr w:type="spellStart"/>
       <w:r>
+        <w:rPr>
+          <w:strike/>
+        </w:rPr>
         <w:t>lister</w:t>
       </w:r>
       <w:proofErr w:type="spellEnd"/>
       <w:r>
+        <w:rPr>
+          <w:strike/>
+        </w:rPr>
         <w:t xml:space="preserve"> would get a cookie, which contains a unique code that would allow the </w:t>
       </w:r>
       <w:proofErr w:type="spellStart"/>
       <w:r>
+        <w:rPr>
+          <w:strike/>
+        </w:rPr>
         <w:t>lister</w:t>
       </w:r>
       <w:proofErr w:type="spellEnd"/>
       <w:r>
+        <w:rPr>
+          <w:strike/>
+        </w:rPr>
         <w:t xml:space="preserve"> to connect with the correct larder. This means that:</w:t>
       </w:r>
     </w:p>
@@ -3232,8 +3306,14 @@
           <w:ilvl w:val="0"/>
           <w:numId w:val="4"/>
         </w:numPr>
-      </w:pPr>
-      <w:r>
+        <w:rPr>
+          <w:strike/>
+        </w:rPr>
+      </w:pPr>
+      <w:r>
+        <w:rPr>
+          <w:strike/>
+        </w:rPr>
         <w:t>The larder is stored on the internet, in case a proposer wanted to take a look at it.</w:t>
       </w:r>
     </w:p>
@@ -3244,16 +3324,28 @@
           <w:ilvl w:val="0"/>
           <w:numId w:val="4"/>
         </w:numPr>
-      </w:pPr>
-      <w:r>
+        <w:rPr>
+          <w:strike/>
+        </w:rPr>
+      </w:pPr>
+      <w:r>
+        <w:rPr>
+          <w:strike/>
+        </w:rPr>
         <w:t xml:space="preserve">The </w:t>
       </w:r>
       <w:proofErr w:type="spellStart"/>
       <w:r>
+        <w:rPr>
+          <w:strike/>
+        </w:rPr>
         <w:t>lister</w:t>
       </w:r>
       <w:proofErr w:type="spellEnd"/>
       <w:r>
+        <w:rPr>
+          <w:strike/>
+        </w:rPr>
         <w:t xml:space="preserve"> can return to his pantry, with the full administration powers that come with being the owner of said larder.</w:t>
       </w:r>
     </w:p>
@@ -3264,8 +3356,14 @@
           <w:ilvl w:val="0"/>
           <w:numId w:val="4"/>
         </w:numPr>
-      </w:pPr>
-      <w:r>
+        <w:rPr>
+          <w:strike/>
+        </w:rPr>
+      </w:pPr>
+      <w:r>
+        <w:rPr>
+          <w:strike/>
+        </w:rPr>
         <w:t>No one needs to make an account!</w:t>
       </w:r>
     </w:p>
@@ -3365,8 +3463,6 @@
         </w:rPr>
         <w:t xml:space="preserve"> Accounts allow for extending functionality, (I.E. “Top Ten Proposers”)</w:t>
       </w:r>
-      <w:bookmarkStart w:id="10" w:name="_GoBack"/>
-      <w:bookmarkEnd w:id="10"/>
     </w:p>
     <w:p>
       <w:pPr>

</xml_diff>

<commit_message>
Attempted finangling to play nice with Django
Didn't Work. Got blocked by CORS.

Good News! the Django-cors-headers module allows one to change the CORS Policy.
Ugly news:  I have to download one more thing. Reat + Django should be rather common, why is CORS headers not part of django by default?
Bad News: CORS header doesn't work.
</commit_message>
<xml_diff>
--- a/Food My Thought.docx
+++ b/Food My Thought.docx
@@ -2245,13 +2245,8 @@
     </w:p>
     <w:p>
       <w:r>
-        <w:t xml:space="preserve">When selected, most of the right-had side is taken up by a </w:t>
-      </w:r>
-      <w:proofErr w:type="gramStart"/>
-      <w:r>
-        <w:t>card .</w:t>
-      </w:r>
-      <w:proofErr w:type="gramEnd"/>
+        <w:t>When selected, most of the right-had side is taken up by a card .</w:t>
+      </w:r>
     </w:p>
     <w:p>
       <w:r>
@@ -2419,15 +2414,7 @@
     </w:p>
     <w:p>
       <w:r>
-        <w:t xml:space="preserve">As you can see, the grey section is being taken up by the description of a recipe. Furthermore, </w:t>
-      </w:r>
-      <w:proofErr w:type="gramStart"/>
-      <w:r>
-        <w:t>Half</w:t>
-      </w:r>
-      <w:proofErr w:type="gramEnd"/>
-      <w:r>
-        <w:t xml:space="preserve"> and Half, another ingredient in the larder is highlighted.</w:t>
+        <w:t>As you can see, the grey section is being taken up by the description of a recipe. Furthermore, Half and Half, another ingredient in the larder is highlighted.</w:t>
       </w:r>
     </w:p>
     <w:p>
@@ -3022,15 +3009,7 @@
     </w:p>
     <w:p>
       <w:r>
-        <w:t xml:space="preserve">You may have noticed a small star next to the recipe for chocolate fish-eggs. The program shall remember that this particular recipe was written in this particular session, and allow the proposer to </w:t>
-      </w:r>
-      <w:proofErr w:type="gramStart"/>
-      <w:r>
-        <w:t>both edit or</w:t>
-      </w:r>
-      <w:proofErr w:type="gramEnd"/>
-      <w:r>
-        <w:t xml:space="preserve"> delete such a recipe in the future.</w:t>
+        <w:t>You may have noticed a small star next to the recipe for chocolate fish-eggs. The program shall remember that this particular recipe was written in this particular session, and allow the proposer to both edit or delete such a recipe in the future.</w:t>
       </w:r>
     </w:p>
     <w:p>
@@ -3153,22 +3132,20 @@
       <w:r>
         <w:t>e</w:t>
       </w:r>
-      <w:bookmarkStart w:id="8" w:name="_GoBack"/>
+      <w:r>
+        <w:t>e that the “Reject this recipe” button has become the “Reconsider, this might actually be good” button.</w:t>
+      </w:r>
+    </w:p>
+    <w:p/>
+    <w:p>
+      <w:pPr>
+        <w:pStyle w:val="Heading1"/>
+      </w:pPr>
+      <w:bookmarkStart w:id="8" w:name="_Toc189655580"/>
+      <w:r>
+        <w:t>Data schema</w:t>
+      </w:r>
       <w:bookmarkEnd w:id="8"/>
-      <w:r>
-        <w:t>e that the “Reject this recipe” button has become the “Reconsider, this might actually be good” button.</w:t>
-      </w:r>
-    </w:p>
-    <w:p/>
-    <w:p>
-      <w:pPr>
-        <w:pStyle w:val="Heading1"/>
-      </w:pPr>
-      <w:bookmarkStart w:id="9" w:name="_Toc189655580"/>
-      <w:r>
-        <w:t>Data schema</w:t>
-      </w:r>
-      <w:bookmarkEnd w:id="9"/>
     </w:p>
     <w:p>
       <w:r>
@@ -3354,6 +3331,7 @@
       <w:pPr>
         <w:pStyle w:val="Heading1"/>
       </w:pPr>
+      <w:bookmarkStart w:id="9" w:name="_Toc189655582"/>
       <w:bookmarkStart w:id="10" w:name="_Toc189655581"/>
       <w:r>
         <w:t>I, personally, don’t like making accounts for every itty-bitty thing</w:t>
@@ -3373,33 +3351,34 @@
         <w:rPr>
           <w:strike/>
         </w:rPr>
-        <w:t>That is, I would be hesitant to use this app if it required me to send my e-mail</w:t>
-      </w:r>
+        <w:t xml:space="preserve">That is, I would be hesitant to use this app if it required me to send my e-mail and type in a password every time I called on nameless </w:t>
+      </w:r>
+      <w:proofErr w:type="spellStart"/>
       <w:r>
         <w:rPr>
           <w:strike/>
         </w:rPr>
-        <w:t xml:space="preserve"> and type in a password every time I called on nameless </w:t>
-      </w:r>
-      <w:proofErr w:type="spellStart"/>
+        <w:t>trashposters</w:t>
+      </w:r>
+      <w:proofErr w:type="spellEnd"/>
       <w:r>
         <w:rPr>
           <w:strike/>
         </w:rPr>
-        <w:t>trash</w:t>
-      </w:r>
-      <w:r>
+        <w:t xml:space="preserve"> and internet trolls to tell me what exactly to do with my Quinoa.</w:t>
+      </w:r>
+    </w:p>
+    <w:p>
+      <w:pPr>
         <w:rPr>
           <w:strike/>
         </w:rPr>
-        <w:t>posters</w:t>
-      </w:r>
-      <w:proofErr w:type="spellEnd"/>
+      </w:pPr>
       <w:r>
         <w:rPr>
           <w:strike/>
         </w:rPr>
-        <w:t xml:space="preserve"> and internet trolls to tell me what exactly to do with my Quinoa.</w:t>
+        <w:t>As such, this app would rely on cookies.</w:t>
       </w:r>
     </w:p>
     <w:p>
@@ -3412,31 +3391,16 @@
         <w:rPr>
           <w:strike/>
         </w:rPr>
-        <w:t>As such, this app would rely on cookies.</w:t>
-      </w:r>
-    </w:p>
-    <w:p>
-      <w:pPr>
+        <w:t xml:space="preserve">The </w:t>
+      </w:r>
+      <w:proofErr w:type="spellStart"/>
+      <w:r>
         <w:rPr>
           <w:strike/>
         </w:rPr>
-      </w:pPr>
-      <w:r>
-        <w:rPr>
-          <w:strike/>
-        </w:rPr>
-        <w:t xml:space="preserve">The </w:t>
-      </w:r>
-      <w:proofErr w:type="spellStart"/>
-      <w:proofErr w:type="gramStart"/>
-      <w:r>
-        <w:rPr>
-          <w:strike/>
-        </w:rPr>
         <w:t>url</w:t>
       </w:r>
       <w:proofErr w:type="spellEnd"/>
-      <w:proofErr w:type="gramEnd"/>
       <w:r>
         <w:rPr>
           <w:strike/>
@@ -3669,11 +3633,10 @@
       <w:pPr>
         <w:pStyle w:val="Heading1"/>
       </w:pPr>
-      <w:bookmarkStart w:id="11" w:name="_Toc189655582"/>
       <w:r>
         <w:t>Sharing is caring!</w:t>
       </w:r>
-      <w:bookmarkEnd w:id="11"/>
+      <w:bookmarkEnd w:id="9"/>
       <w:r>
         <w:t xml:space="preserve"> </w:t>
       </w:r>
@@ -4048,13 +4011,13 @@
       <w:pPr>
         <w:pStyle w:val="Heading1"/>
       </w:pPr>
-      <w:bookmarkStart w:id="12" w:name="_Our_great_and"/>
-      <w:bookmarkStart w:id="13" w:name="_Toc189655583"/>
+      <w:bookmarkStart w:id="11" w:name="_Our_great_and"/>
+      <w:bookmarkStart w:id="12" w:name="_Toc189655583"/>
+      <w:bookmarkEnd w:id="11"/>
+      <w:r>
+        <w:t>What can you make with Moldy cheese?</w:t>
+      </w:r>
       <w:bookmarkEnd w:id="12"/>
-      <w:r>
-        <w:t>What can you make with Moldy cheese?</w:t>
-      </w:r>
-      <w:bookmarkEnd w:id="13"/>
     </w:p>
     <w:p>
       <w:r>
@@ -4078,15 +4041,7 @@
         <w:t xml:space="preserve"> never</w:t>
       </w:r>
       <w:r>
-        <w:t xml:space="preserve"> logs on to look at their </w:t>
-      </w:r>
-      <w:proofErr w:type="gramStart"/>
-      <w:r>
-        <w:t>larder ,</w:t>
-      </w:r>
-      <w:proofErr w:type="gramEnd"/>
-      <w:r>
-        <w:t xml:space="preserve"> and </w:t>
+        <w:t xml:space="preserve"> logs on to look at their larder , and </w:t>
       </w:r>
       <w:r>
         <w:t xml:space="preserve">the larder is boring enough that no-one has commented on any of the food items, what is to be done? </w:t>
@@ -4160,12 +4115,12 @@
       <w:pPr>
         <w:pStyle w:val="Heading2"/>
       </w:pPr>
-      <w:bookmarkStart w:id="14" w:name="_Toc189655584"/>
+      <w:bookmarkStart w:id="13" w:name="_Toc189655584"/>
       <w:r>
         <w:lastRenderedPageBreak/>
         <w:t>When should we delete a larder?</w:t>
       </w:r>
-      <w:bookmarkEnd w:id="14"/>
+      <w:bookmarkEnd w:id="13"/>
     </w:p>
     <w:p>
       <w:r>
@@ -4490,13 +4445,8 @@
     </w:p>
     <w:p>
       <w:r>
-        <w:t xml:space="preserve">Whichever is further in the </w:t>
-      </w:r>
-      <w:proofErr w:type="gramStart"/>
-      <w:r>
-        <w:t>future.</w:t>
-      </w:r>
-      <w:proofErr w:type="gramEnd"/>
+        <w:t>Whichever is further in the future.</w:t>
+      </w:r>
     </w:p>
     <w:p>
       <w:r>
@@ -4841,14 +4791,14 @@
       <w:pPr>
         <w:pStyle w:val="Heading2"/>
       </w:pPr>
-      <w:bookmarkStart w:id="15" w:name="_Toc189655585"/>
+      <w:bookmarkStart w:id="14" w:name="_Toc189655585"/>
       <w:r>
         <w:t>Please let me gander at this corpse of</w:t>
       </w:r>
       <w:r>
         <w:t xml:space="preserve"> a larder?</w:t>
       </w:r>
-      <w:bookmarkEnd w:id="15"/>
+      <w:bookmarkEnd w:id="14"/>
     </w:p>
     <w:p>
       <w:r>
@@ -4954,7 +4904,7 @@
       <w:pPr>
         <w:pStyle w:val="Heading2"/>
       </w:pPr>
-      <w:bookmarkStart w:id="16" w:name="_Toc189655586"/>
+      <w:bookmarkStart w:id="15" w:name="_Toc189655586"/>
       <w:r>
         <w:t xml:space="preserve">How should we </w:t>
       </w:r>
@@ -4964,7 +4914,7 @@
       <w:r>
         <w:t xml:space="preserve"> a larder?</w:t>
       </w:r>
-      <w:bookmarkEnd w:id="16"/>
+      <w:bookmarkEnd w:id="15"/>
     </w:p>
     <w:p>
       <w:r>
@@ -5004,15 +4954,7 @@
         <w:t>a</w:t>
       </w:r>
       <w:r>
-        <w:t xml:space="preserve"> request to the server for all the information related to </w:t>
-      </w:r>
-      <w:proofErr w:type="gramStart"/>
-      <w:r>
-        <w:t>said</w:t>
-      </w:r>
-      <w:proofErr w:type="gramEnd"/>
-      <w:r>
-        <w:t xml:space="preserve"> larder. The server checks the date, and if today’s date is after the delete date, then the server </w:t>
+        <w:t xml:space="preserve"> request to the server for all the information related to said larder. The server checks the date, and if today’s date is after the delete date, then the server </w:t>
       </w:r>
       <w:r>
         <w:t>marks</w:t>
@@ -5128,70 +5070,68 @@
       <w:pPr>
         <w:pStyle w:val="Heading1"/>
       </w:pPr>
-      <w:bookmarkStart w:id="17" w:name="_Toc189655587"/>
+      <w:bookmarkStart w:id="16" w:name="_Toc189655587"/>
       <w:r>
         <w:t>Our great and glorious human civilization has better things to do with storage power</w:t>
       </w:r>
+      <w:bookmarkEnd w:id="16"/>
+    </w:p>
+    <w:p>
+      <w:pPr>
+        <w:rPr>
+          <w:strike/>
+        </w:rPr>
+      </w:pPr>
+      <w:r>
+        <w:rPr>
+          <w:strike/>
+        </w:rPr>
+        <w:t>How do we avoid clogging up our server with long-forgotten larders? If no-one logs on to look at their larder in a long time, and no-body’s commenting on it anymore, what use is it? For that end, I propose we assume that larders which are left unused long enough can be safely deleted</w:t>
+      </w:r>
+      <w:r>
+        <w:rPr>
+          <w:strike/>
+        </w:rPr>
+        <w:t xml:space="preserve">. </w:t>
+      </w:r>
+      <w:r>
+        <w:rPr>
+          <w:strike/>
+        </w:rPr>
+        <w:t>Then, after making such an assumption, we delete them.</w:t>
+      </w:r>
+    </w:p>
+    <w:p>
+      <w:r>
+        <w:t>Thanks to a wonderful tactic known as “Kicking the can down the road”, we shall hold off on deleting unused larders until this website gets around a hundred thousand larders. Until then, storage is cheap, and if someone has the deep curiosity to cruise</w:t>
+      </w:r>
+      <w:r>
+        <w:t xml:space="preserve"> through old larders and recipes</w:t>
+      </w:r>
+      <w:r>
+        <w:t>, they can knock themselves out.</w:t>
+      </w:r>
+    </w:p>
+    <w:p>
+      <w:r>
+        <w:t xml:space="preserve">Unfortunately, some people might get their panties in a twist if they learnt that their previously-reliable list of food, after 4 or so years of being unused, has been entirely deleted. Sigh. </w:t>
+      </w:r>
+    </w:p>
+    <w:p/>
+    <w:p>
+      <w:pPr>
+        <w:pStyle w:val="Heading1"/>
+      </w:pPr>
+      <w:bookmarkStart w:id="17" w:name="_Toc189655588"/>
+      <w:proofErr w:type="spellStart"/>
+      <w:r>
+        <w:t>rOle</w:t>
+      </w:r>
+      <w:proofErr w:type="spellEnd"/>
+      <w:r>
+        <w:t xml:space="preserve"> reversal.</w:t>
+      </w:r>
       <w:bookmarkEnd w:id="17"/>
-    </w:p>
-    <w:p>
-      <w:pPr>
-        <w:rPr>
-          <w:strike/>
-        </w:rPr>
-      </w:pPr>
-      <w:r>
-        <w:rPr>
-          <w:strike/>
-        </w:rPr>
-        <w:t>How do we avoid clogging up our server with long-forgotten larders? If no-one logs on to look at their larder in a long time, and no-body’s commenting on it anymore, what use is it? For that end, I propose we assume that larders which are left unused long enough can be safely deleted</w:t>
-      </w:r>
-      <w:r>
-        <w:rPr>
-          <w:strike/>
-        </w:rPr>
-        <w:t xml:space="preserve">. </w:t>
-      </w:r>
-      <w:r>
-        <w:rPr>
-          <w:strike/>
-        </w:rPr>
-        <w:t>Then, after making such an assumption, we delete them.</w:t>
-      </w:r>
-    </w:p>
-    <w:p>
-      <w:r>
-        <w:t>Thanks to a wonderful tactic known as “Kicking the can down the road”, we shall hold off on deleting unused larders until this website gets around a hundred thousand larders. Until then, storage is cheap, and if someone has the deep curiosity to cruise</w:t>
-      </w:r>
-      <w:r>
-        <w:t xml:space="preserve"> through old larders and recipes</w:t>
-      </w:r>
-      <w:r>
-        <w:t>, they can knock themselves out.</w:t>
-      </w:r>
-    </w:p>
-    <w:p>
-      <w:r>
-        <w:t xml:space="preserve">Unfortunately, some people might get their panties in a twist if they learnt that their previously-reliable list of food, after 4 or so years of being unused, has been entirely deleted. Sigh. </w:t>
-      </w:r>
-    </w:p>
-    <w:p/>
-    <w:p>
-      <w:pPr>
-        <w:pStyle w:val="Heading1"/>
-      </w:pPr>
-      <w:bookmarkStart w:id="18" w:name="_Toc189655588"/>
-      <w:proofErr w:type="spellStart"/>
-      <w:proofErr w:type="gramStart"/>
-      <w:r>
-        <w:t>rOle</w:t>
-      </w:r>
-      <w:proofErr w:type="spellEnd"/>
-      <w:proofErr w:type="gramEnd"/>
-      <w:r>
-        <w:t xml:space="preserve"> reversal.</w:t>
-      </w:r>
-      <w:bookmarkEnd w:id="18"/>
     </w:p>
     <w:p>
       <w:r>
@@ -5285,13 +5225,13 @@
       <w:pPr>
         <w:pStyle w:val="Heading1"/>
       </w:pPr>
-      <w:bookmarkStart w:id="19" w:name="_None_Pizza_without"/>
-      <w:bookmarkStart w:id="20" w:name="_Toc189655589"/>
+      <w:bookmarkStart w:id="18" w:name="_None_Pizza_without"/>
+      <w:bookmarkStart w:id="19" w:name="_Toc189655589"/>
+      <w:bookmarkEnd w:id="18"/>
+      <w:r>
+        <w:t>None Pizza without left beef</w:t>
+      </w:r>
       <w:bookmarkEnd w:id="19"/>
-      <w:r>
-        <w:t>None Pizza without left beef</w:t>
-      </w:r>
-      <w:bookmarkEnd w:id="20"/>
       <w:r>
         <w:t xml:space="preserve"> </w:t>
       </w:r>
@@ -5498,11 +5438,11 @@
       <w:pPr>
         <w:pStyle w:val="Heading1"/>
       </w:pPr>
-      <w:bookmarkStart w:id="21" w:name="_Toc189655590"/>
+      <w:bookmarkStart w:id="20" w:name="_Toc189655590"/>
       <w:r>
         <w:t>Changing Categories.</w:t>
       </w:r>
-      <w:bookmarkEnd w:id="21"/>
+      <w:bookmarkEnd w:id="20"/>
     </w:p>
     <w:p>
       <w:r>
@@ -5777,11 +5717,11 @@
       <w:pPr>
         <w:pStyle w:val="Heading2"/>
       </w:pPr>
-      <w:bookmarkStart w:id="22" w:name="_Toc189655591"/>
+      <w:bookmarkStart w:id="21" w:name="_Toc189655591"/>
       <w:r>
         <w:t>Simple renaming</w:t>
       </w:r>
-      <w:bookmarkEnd w:id="22"/>
+      <w:bookmarkEnd w:id="21"/>
     </w:p>
     <w:p>
       <w:r>
@@ -5951,11 +5891,13 @@
       <w:pPr>
         <w:pStyle w:val="Heading2"/>
       </w:pPr>
-      <w:bookmarkStart w:id="23" w:name="_Toc189655592"/>
+      <w:bookmarkStart w:id="22" w:name="_Toc189655592"/>
+      <w:bookmarkStart w:id="23" w:name="_GoBack"/>
+      <w:bookmarkEnd w:id="23"/>
       <w:r>
         <w:t>Category Changes</w:t>
       </w:r>
-      <w:bookmarkEnd w:id="23"/>
+      <w:bookmarkEnd w:id="22"/>
     </w:p>
     <w:p>
       <w:r>

</xml_diff>

<commit_message>
"Logging in" While already logged in re-directs you to your Larder.
This is pretty neat: Now I finally have something telling me weather or not I am logged in, without having to rely on faith that I do indeed have a session ID and am logged in.
</commit_message>
<xml_diff>
--- a/Food My Thought.docx
+++ b/Food My Thought.docx
@@ -3345,11 +3345,13 @@
       <w:pPr>
         <w:rPr>
           <w:strike/>
+          <w:color w:val="538135" w:themeColor="accent6" w:themeShade="BF"/>
         </w:rPr>
       </w:pPr>
       <w:r>
         <w:rPr>
           <w:strike/>
+          <w:color w:val="538135" w:themeColor="accent6" w:themeShade="BF"/>
         </w:rPr>
         <w:t xml:space="preserve">That is, I would be hesitant to use this app if it required me to send my e-mail and type in a password every time I called on nameless </w:t>
       </w:r>
@@ -3357,6 +3359,7 @@
       <w:r>
         <w:rPr>
           <w:strike/>
+          <w:color w:val="538135" w:themeColor="accent6" w:themeShade="BF"/>
         </w:rPr>
         <w:t>trashposters</w:t>
       </w:r>
@@ -3364,6 +3367,7 @@
       <w:r>
         <w:rPr>
           <w:strike/>
+          <w:color w:val="538135" w:themeColor="accent6" w:themeShade="BF"/>
         </w:rPr>
         <w:t xml:space="preserve"> and internet trolls to tell me what exactly to do with my Quinoa.</w:t>
       </w:r>
@@ -3372,11 +3376,13 @@
       <w:pPr>
         <w:rPr>
           <w:strike/>
+          <w:color w:val="538135" w:themeColor="accent6" w:themeShade="BF"/>
         </w:rPr>
       </w:pPr>
       <w:r>
         <w:rPr>
           <w:strike/>
+          <w:color w:val="538135" w:themeColor="accent6" w:themeShade="BF"/>
         </w:rPr>
         <w:t>As such, this app would rely on cookies.</w:t>
       </w:r>
@@ -3385,11 +3391,13 @@
       <w:pPr>
         <w:rPr>
           <w:strike/>
+          <w:color w:val="538135" w:themeColor="accent6" w:themeShade="BF"/>
         </w:rPr>
       </w:pPr>
       <w:r>
         <w:rPr>
           <w:strike/>
+          <w:color w:val="538135" w:themeColor="accent6" w:themeShade="BF"/>
         </w:rPr>
         <w:t xml:space="preserve">The </w:t>
       </w:r>
@@ -3397,6 +3405,7 @@
       <w:r>
         <w:rPr>
           <w:strike/>
+          <w:color w:val="538135" w:themeColor="accent6" w:themeShade="BF"/>
         </w:rPr>
         <w:t>url</w:t>
       </w:r>
@@ -3404,6 +3413,7 @@
       <w:r>
         <w:rPr>
           <w:strike/>
+          <w:color w:val="538135" w:themeColor="accent6" w:themeShade="BF"/>
         </w:rPr>
         <w:t xml:space="preserve"> for the </w:t>
       </w:r>
@@ -3411,6 +3421,7 @@
       <w:r>
         <w:rPr>
           <w:strike/>
+          <w:color w:val="538135" w:themeColor="accent6" w:themeShade="BF"/>
         </w:rPr>
         <w:t>lister</w:t>
       </w:r>
@@ -3418,6 +3429,7 @@
       <w:r>
         <w:rPr>
           <w:strike/>
+          <w:color w:val="538135" w:themeColor="accent6" w:themeShade="BF"/>
         </w:rPr>
         <w:t xml:space="preserve"> page would be the same, </w:t>
       </w:r>
@@ -3425,6 +3437,7 @@
       <w:r>
         <w:rPr>
           <w:strike/>
+          <w:color w:val="538135" w:themeColor="accent6" w:themeShade="BF"/>
         </w:rPr>
         <w:t>irreguardless</w:t>
       </w:r>
@@ -3432,6 +3445,7 @@
       <w:r>
         <w:rPr>
           <w:strike/>
+          <w:color w:val="538135" w:themeColor="accent6" w:themeShade="BF"/>
         </w:rPr>
         <w:t xml:space="preserve"> of who is the one posting. Each </w:t>
       </w:r>
@@ -3439,6 +3453,7 @@
       <w:r>
         <w:rPr>
           <w:strike/>
+          <w:color w:val="538135" w:themeColor="accent6" w:themeShade="BF"/>
         </w:rPr>
         <w:t>lister</w:t>
       </w:r>
@@ -3446,6 +3461,7 @@
       <w:r>
         <w:rPr>
           <w:strike/>
+          <w:color w:val="538135" w:themeColor="accent6" w:themeShade="BF"/>
         </w:rPr>
         <w:t xml:space="preserve"> would get a cookie, which contains a unique code that would allow the </w:t>
       </w:r>
@@ -3453,6 +3469,7 @@
       <w:r>
         <w:rPr>
           <w:strike/>
+          <w:color w:val="538135" w:themeColor="accent6" w:themeShade="BF"/>
         </w:rPr>
         <w:t>lister</w:t>
       </w:r>
@@ -3460,6 +3477,7 @@
       <w:r>
         <w:rPr>
           <w:strike/>
+          <w:color w:val="538135" w:themeColor="accent6" w:themeShade="BF"/>
         </w:rPr>
         <w:t xml:space="preserve"> to connect with the correct larder. This means that:</w:t>
       </w:r>
@@ -3473,11 +3491,13 @@
         </w:numPr>
         <w:rPr>
           <w:strike/>
+          <w:color w:val="538135" w:themeColor="accent6" w:themeShade="BF"/>
         </w:rPr>
       </w:pPr>
       <w:r>
         <w:rPr>
           <w:strike/>
+          <w:color w:val="538135" w:themeColor="accent6" w:themeShade="BF"/>
         </w:rPr>
         <w:t>The larder is stored on the internet, in case a proposer wanted to take a look at it.</w:t>
       </w:r>
@@ -3491,11 +3511,13 @@
         </w:numPr>
         <w:rPr>
           <w:strike/>
+          <w:color w:val="538135" w:themeColor="accent6" w:themeShade="BF"/>
         </w:rPr>
       </w:pPr>
       <w:r>
         <w:rPr>
           <w:strike/>
+          <w:color w:val="538135" w:themeColor="accent6" w:themeShade="BF"/>
         </w:rPr>
         <w:t xml:space="preserve">The </w:t>
       </w:r>
@@ -3503,6 +3525,7 @@
       <w:r>
         <w:rPr>
           <w:strike/>
+          <w:color w:val="538135" w:themeColor="accent6" w:themeShade="BF"/>
         </w:rPr>
         <w:t>lister</w:t>
       </w:r>
@@ -3510,6 +3533,7 @@
       <w:r>
         <w:rPr>
           <w:strike/>
+          <w:color w:val="538135" w:themeColor="accent6" w:themeShade="BF"/>
         </w:rPr>
         <w:t xml:space="preserve"> can return to his pantry, with the full administration powers that come with being the owner of said larder.</w:t>
       </w:r>
@@ -3523,17 +3547,27 @@
         </w:numPr>
         <w:rPr>
           <w:strike/>
+          <w:color w:val="538135" w:themeColor="accent6" w:themeShade="BF"/>
         </w:rPr>
       </w:pPr>
       <w:r>
         <w:rPr>
           <w:strike/>
+          <w:color w:val="538135" w:themeColor="accent6" w:themeShade="BF"/>
         </w:rPr>
         <w:t>No one needs to make an account!</w:t>
       </w:r>
     </w:p>
     <w:p>
-      <w:r>
+      <w:pPr>
+        <w:rPr>
+          <w:color w:val="538135" w:themeColor="accent6" w:themeShade="BF"/>
+        </w:rPr>
+      </w:pPr>
+      <w:r>
+        <w:rPr>
+          <w:color w:val="538135" w:themeColor="accent6" w:themeShade="BF"/>
+        </w:rPr>
         <w:t xml:space="preserve">UPDATE: I was informed that my complicated cookie scheme ran into a couple of problems: </w:t>
       </w:r>
     </w:p>
@@ -3541,11 +3575,13 @@
       <w:pPr>
         <w:rPr>
           <w:rFonts w:asciiTheme="minorHAnsi" w:hAnsiTheme="minorHAnsi"/>
+          <w:color w:val="538135" w:themeColor="accent6" w:themeShade="BF"/>
         </w:rPr>
       </w:pPr>
       <w:r>
         <w:rPr>
           <w:rFonts w:asciiTheme="minorHAnsi" w:hAnsiTheme="minorHAnsi"/>
+          <w:color w:val="538135" w:themeColor="accent6" w:themeShade="BF"/>
           <w:lang w:val="ru-RU"/>
         </w:rPr>
         <w:t>Один</w:t>
@@ -3553,54 +3589,59 @@
       <w:r>
         <w:rPr>
           <w:rFonts w:asciiTheme="minorHAnsi" w:hAnsiTheme="minorHAnsi"/>
-        </w:rPr>
-        <w:t>:</w:t>
-      </w:r>
-      <w:r>
+          <w:color w:val="538135" w:themeColor="accent6" w:themeShade="BF"/>
+        </w:rPr>
+        <w:t>: Some folks want to be able to access the same larder on two different devices</w:t>
+      </w:r>
+    </w:p>
+    <w:p>
+      <w:pPr>
         <w:rPr>
           <w:rFonts w:asciiTheme="minorHAnsi" w:hAnsiTheme="minorHAnsi"/>
-        </w:rPr>
-        <w:t xml:space="preserve"> Some folks want to be able to access the same larder on two different devices</w:t>
-      </w:r>
-    </w:p>
-    <w:p>
-      <w:pPr>
+          <w:color w:val="538135" w:themeColor="accent6" w:themeShade="BF"/>
+        </w:rPr>
+      </w:pPr>
+      <w:r>
         <w:rPr>
           <w:rFonts w:asciiTheme="minorHAnsi" w:hAnsiTheme="minorHAnsi"/>
-        </w:rPr>
-      </w:pPr>
+          <w:strike/>
+          <w:color w:val="538135" w:themeColor="accent6" w:themeShade="BF"/>
+          <w:lang w:val="ru-RU"/>
+        </w:rPr>
+        <w:t>Два</w:t>
+      </w:r>
       <w:r>
         <w:rPr>
           <w:rFonts w:asciiTheme="minorHAnsi" w:hAnsiTheme="minorHAnsi"/>
-          <w:lang w:val="ru-RU"/>
-        </w:rPr>
-        <w:t>Два</w:t>
-      </w:r>
+          <w:strike/>
+          <w:color w:val="538135" w:themeColor="accent6" w:themeShade="BF"/>
+        </w:rPr>
+        <w:t xml:space="preserve">: I can brag about using AWS </w:t>
+      </w:r>
+      <w:proofErr w:type="spellStart"/>
       <w:r>
         <w:rPr>
           <w:rFonts w:asciiTheme="minorHAnsi" w:hAnsiTheme="minorHAnsi"/>
-        </w:rPr>
-        <w:t>:</w:t>
-      </w:r>
+          <w:strike/>
+          <w:color w:val="538135" w:themeColor="accent6" w:themeShade="BF"/>
+        </w:rPr>
+        <w:t>Cognito</w:t>
+      </w:r>
+      <w:proofErr w:type="spellEnd"/>
       <w:r>
         <w:rPr>
           <w:rFonts w:asciiTheme="minorHAnsi" w:hAnsiTheme="minorHAnsi"/>
-        </w:rPr>
-        <w:t xml:space="preserve"> I can brag about using AWS </w:t>
-      </w:r>
-      <w:proofErr w:type="spellStart"/>
+          <w:strike/>
+          <w:color w:val="538135" w:themeColor="accent6" w:themeShade="BF"/>
+        </w:rPr>
+        <w:t xml:space="preserve"> on my resume</w:t>
+      </w:r>
       <w:r>
         <w:rPr>
           <w:rFonts w:asciiTheme="minorHAnsi" w:hAnsiTheme="minorHAnsi"/>
-        </w:rPr>
-        <w:t>Cognito</w:t>
-      </w:r>
-      <w:proofErr w:type="spellEnd"/>
-      <w:r>
-        <w:rPr>
-          <w:rFonts w:asciiTheme="minorHAnsi" w:hAnsiTheme="minorHAnsi"/>
-        </w:rPr>
-        <w:t xml:space="preserve"> on my resume</w:t>
+          <w:color w:val="538135" w:themeColor="accent6" w:themeShade="BF"/>
+        </w:rPr>
+        <w:t xml:space="preserve"> (I’m using Django for Authentication)</w:t>
       </w:r>
     </w:p>
     <w:p>
@@ -3857,7 +3898,12 @@
       </w:r>
       <w:proofErr w:type="spellEnd"/>
       <w:r>
-        <w:t>” will send the user to a random larder as a proposer, while “list your larder”</w:t>
+        <w:t>” will send the user to a random larder as a proposer, while “list your larder</w:t>
+      </w:r>
+      <w:bookmarkStart w:id="11" w:name="_GoBack"/>
+      <w:bookmarkEnd w:id="11"/>
+      <w:r>
+        <w:t>”</w:t>
       </w:r>
       <w:r>
         <w:t xml:space="preserve"> sends the user to their larder as a </w:t>
@@ -4011,13 +4057,13 @@
       <w:pPr>
         <w:pStyle w:val="Heading1"/>
       </w:pPr>
-      <w:bookmarkStart w:id="11" w:name="_Our_great_and"/>
-      <w:bookmarkStart w:id="12" w:name="_Toc189655583"/>
-      <w:bookmarkEnd w:id="11"/>
+      <w:bookmarkStart w:id="12" w:name="_Our_great_and"/>
+      <w:bookmarkStart w:id="13" w:name="_Toc189655583"/>
+      <w:bookmarkEnd w:id="12"/>
       <w:r>
         <w:t>What can you make with Moldy cheese?</w:t>
       </w:r>
-      <w:bookmarkEnd w:id="12"/>
+      <w:bookmarkEnd w:id="13"/>
     </w:p>
     <w:p>
       <w:r>
@@ -4115,12 +4161,12 @@
       <w:pPr>
         <w:pStyle w:val="Heading2"/>
       </w:pPr>
-      <w:bookmarkStart w:id="13" w:name="_Toc189655584"/>
+      <w:bookmarkStart w:id="14" w:name="_Toc189655584"/>
       <w:r>
         <w:lastRenderedPageBreak/>
         <w:t>When should we delete a larder?</w:t>
       </w:r>
-      <w:bookmarkEnd w:id="13"/>
+      <w:bookmarkEnd w:id="14"/>
     </w:p>
     <w:p>
       <w:r>
@@ -4513,12 +4559,7 @@
           </w:tcPr>
           <w:p>
             <w:r>
-              <w:t>L</w:t>
-            </w:r>
-            <w:bookmarkStart w:id="14" w:name="_GoBack"/>
-            <w:bookmarkEnd w:id="14"/>
-            <w:r>
-              <w:t>ister looks at his larder a subsequent time</w:t>
+              <w:t>Lister looks at his larder a subsequent time</w:t>
             </w:r>
           </w:p>
         </w:tc>

</xml_diff>